<commit_message>
QEPvLoadSave: Update documentation - describe additonal context menu entries.
</commit_message>
<xml_diff>
--- a/documentation/source/QEPvLoadSave.docx
+++ b/documentation/source/QEPvLoadSave.docx
@@ -95,15 +95,7 @@
       </w:r>
       <w:r>
         <w:rPr/>
-        <w:t xml:space="preserve">June </w:t>
-      </w:r>
-      <w:r>
-        <w:rPr/>
-        <w:t>202</w:t>
-      </w:r>
-      <w:r>
-        <w:rPr/>
-        <w:t>6</w:t>
+        <w:t>June 2026</w:t>
       </w:r>
     </w:p>
     <w:p>
@@ -146,19 +138,7 @@
         <w:rPr>
           <w:rFonts w:eastAsia="Times New Roman" w:cs="Courier New"/>
         </w:rPr>
-        <w:t>Copyright (c) 2020-</w:t>
-      </w:r>
-      <w:r>
-        <w:rPr>
-          <w:rFonts w:eastAsia="Times New Roman" w:cs="Courier New"/>
-        </w:rPr>
-        <w:t>2026</w:t>
-      </w:r>
-      <w:r>
-        <w:rPr>
-          <w:rFonts w:eastAsia="Times New Roman" w:cs="Courier New"/>
-        </w:rPr>
-        <w:t xml:space="preserve"> Australian Synchrotron</w:t>
+        <w:t>Copyright (c) 2020-2026 Australian Synchrotron</w:t>
         <w:br/>
       </w:r>
     </w:p>
@@ -221,7 +201,7 @@
       <w:sdtContent>
         <w:p>
           <w:pPr>
-            <w:pStyle w:val="TOCHeading"/>
+            <w:pStyle w:val="ContentsHeading"/>
             <w:rPr/>
           </w:pPr>
           <w:r>
@@ -237,11 +217,9 @@
             <w:pStyle w:val="Contents1"/>
             <w:tabs>
               <w:tab w:val="clear" w:pos="720"/>
-              <w:tab w:val="right" w:pos="9016" w:leader="dot"/>
+              <w:tab w:val="right" w:pos="9026" w:leader="dot"/>
             </w:tabs>
-            <w:rPr>
-              <w:lang w:val="en-GB" w:eastAsia="en-GB"/>
-            </w:rPr>
+            <w:rPr/>
           </w:pPr>
           <w:r>
             <w:fldChar w:fldCharType="begin"/>
@@ -260,45 +238,15 @@
             </w:rPr>
             <w:fldChar w:fldCharType="separate"/>
           </w:r>
-          <w:hyperlink w:anchor="_Toc56779022">
+          <w:hyperlink w:anchor="__RefHeading___Toc620_888842183">
             <w:r>
               <w:rPr>
                 <w:webHidden/>
                 <w:rStyle w:val="IndexLink"/>
               </w:rPr>
               <w:t>Introduction</w:t>
-            </w:r>
-            <w:r>
-              <w:rPr>
-                <w:webHidden/>
-              </w:rPr>
-              <w:fldChar w:fldCharType="begin"/>
-            </w:r>
-            <w:r>
-              <w:rPr>
-                <w:webHidden/>
-              </w:rPr>
-              <w:instrText>PAGEREF _Toc56779022 \h</w:instrText>
-            </w:r>
-            <w:r>
-              <w:rPr>
-                <w:webHidden/>
-              </w:rPr>
-              <w:fldChar w:fldCharType="separate"/>
-            </w:r>
-            <w:r>
-              <w:rPr>
-                <w:rStyle w:val="IndexLink"/>
-                <w:vanish w:val="false"/>
-              </w:rPr>
               <w:tab/>
               <w:t>3</w:t>
-            </w:r>
-            <w:r>
-              <w:rPr>
-                <w:webHidden/>
-              </w:rPr>
-              <w:fldChar w:fldCharType="end"/>
             </w:r>
           </w:hyperlink>
         </w:p>
@@ -307,51 +255,19 @@
             <w:pStyle w:val="Contents1"/>
             <w:tabs>
               <w:tab w:val="clear" w:pos="720"/>
-              <w:tab w:val="right" w:pos="9016" w:leader="dot"/>
+              <w:tab w:val="right" w:pos="9026" w:leader="dot"/>
             </w:tabs>
-            <w:rPr>
-              <w:lang w:val="en-GB" w:eastAsia="en-GB"/>
-            </w:rPr>
+            <w:rPr/>
           </w:pPr>
-          <w:hyperlink w:anchor="_Toc56779023">
+          <w:hyperlink w:anchor="__RefHeading___Toc477_2825637425">
             <w:r>
               <w:rPr>
                 <w:webHidden/>
                 <w:rStyle w:val="IndexLink"/>
               </w:rPr>
               <w:t>QEPvLoadSave</w:t>
-            </w:r>
-            <w:r>
-              <w:rPr>
-                <w:webHidden/>
-              </w:rPr>
-              <w:fldChar w:fldCharType="begin"/>
-            </w:r>
-            <w:r>
-              <w:rPr>
-                <w:webHidden/>
-              </w:rPr>
-              <w:instrText>PAGEREF _Toc56779023 \h</w:instrText>
-            </w:r>
-            <w:r>
-              <w:rPr>
-                <w:webHidden/>
-              </w:rPr>
-              <w:fldChar w:fldCharType="separate"/>
-            </w:r>
-            <w:r>
-              <w:rPr>
-                <w:rStyle w:val="IndexLink"/>
-                <w:vanish w:val="false"/>
-              </w:rPr>
               <w:tab/>
               <w:t>3</w:t>
-            </w:r>
-            <w:r>
-              <w:rPr>
-                <w:webHidden/>
-              </w:rPr>
-              <w:fldChar w:fldCharType="end"/>
             </w:r>
           </w:hyperlink>
         </w:p>
@@ -360,51 +276,19 @@
             <w:pStyle w:val="Contents2"/>
             <w:tabs>
               <w:tab w:val="clear" w:pos="720"/>
-              <w:tab w:val="right" w:pos="9016" w:leader="dot"/>
+              <w:tab w:val="right" w:pos="9026" w:leader="dot"/>
             </w:tabs>
-            <w:rPr>
-              <w:lang w:val="en-GB" w:eastAsia="en-GB"/>
-            </w:rPr>
+            <w:rPr/>
           </w:pPr>
-          <w:hyperlink w:anchor="_Toc56779024">
+          <w:hyperlink w:anchor="__RefHeading___Toc500_2825637425">
             <w:r>
               <w:rPr>
                 <w:webHidden/>
                 <w:rStyle w:val="IndexLink"/>
               </w:rPr>
               <w:t>Description</w:t>
-            </w:r>
-            <w:r>
-              <w:rPr>
-                <w:webHidden/>
-              </w:rPr>
-              <w:fldChar w:fldCharType="begin"/>
-            </w:r>
-            <w:r>
-              <w:rPr>
-                <w:webHidden/>
-              </w:rPr>
-              <w:instrText>PAGEREF _Toc56779024 \h</w:instrText>
-            </w:r>
-            <w:r>
-              <w:rPr>
-                <w:webHidden/>
-              </w:rPr>
-              <w:fldChar w:fldCharType="separate"/>
-            </w:r>
-            <w:r>
-              <w:rPr>
-                <w:rStyle w:val="IndexLink"/>
-                <w:vanish w:val="false"/>
-              </w:rPr>
               <w:tab/>
               <w:t>3</w:t>
-            </w:r>
-            <w:r>
-              <w:rPr>
-                <w:webHidden/>
-              </w:rPr>
-              <w:fldChar w:fldCharType="end"/>
             </w:r>
           </w:hyperlink>
         </w:p>
@@ -413,51 +297,19 @@
             <w:pStyle w:val="Contents3"/>
             <w:tabs>
               <w:tab w:val="clear" w:pos="720"/>
-              <w:tab w:val="right" w:pos="9016" w:leader="dot"/>
+              <w:tab w:val="right" w:pos="9026" w:leader="dot"/>
             </w:tabs>
-            <w:rPr>
-              <w:lang w:val="en-GB" w:eastAsia="en-GB"/>
-            </w:rPr>
+            <w:rPr/>
           </w:pPr>
-          <w:hyperlink w:anchor="_Toc56779025">
+          <w:hyperlink w:anchor="__RefHeading___Toc622_888842183">
             <w:r>
               <w:rPr>
                 <w:webHidden/>
                 <w:rStyle w:val="IndexLink"/>
               </w:rPr>
               <w:t>Tool Bar</w:t>
-            </w:r>
-            <w:r>
-              <w:rPr>
-                <w:webHidden/>
-              </w:rPr>
-              <w:fldChar w:fldCharType="begin"/>
-            </w:r>
-            <w:r>
-              <w:rPr>
-                <w:webHidden/>
-              </w:rPr>
-              <w:instrText>PAGEREF _Toc56779025 \h</w:instrText>
-            </w:r>
-            <w:r>
-              <w:rPr>
-                <w:webHidden/>
-              </w:rPr>
-              <w:fldChar w:fldCharType="separate"/>
-            </w:r>
-            <w:r>
-              <w:rPr>
-                <w:rStyle w:val="IndexLink"/>
-                <w:vanish w:val="false"/>
-              </w:rPr>
               <w:tab/>
-              <w:t>4</w:t>
-            </w:r>
-            <w:r>
-              <w:rPr>
-                <w:webHidden/>
-              </w:rPr>
-              <w:fldChar w:fldCharType="end"/>
+              <w:t>5</w:t>
             </w:r>
           </w:hyperlink>
         </w:p>
@@ -466,51 +318,19 @@
             <w:pStyle w:val="Contents3"/>
             <w:tabs>
               <w:tab w:val="clear" w:pos="720"/>
-              <w:tab w:val="right" w:pos="9016" w:leader="dot"/>
+              <w:tab w:val="right" w:pos="9026" w:leader="dot"/>
             </w:tabs>
-            <w:rPr>
-              <w:lang w:val="en-GB" w:eastAsia="en-GB"/>
-            </w:rPr>
+            <w:rPr/>
           </w:pPr>
-          <w:hyperlink w:anchor="_Toc56779026">
+          <w:hyperlink w:anchor="__RefHeading___Toc624_888842183">
             <w:r>
               <w:rPr>
                 <w:webHidden/>
                 <w:rStyle w:val="IndexLink"/>
               </w:rPr>
               <w:t>Context Menu</w:t>
-            </w:r>
-            <w:r>
-              <w:rPr>
-                <w:webHidden/>
-              </w:rPr>
-              <w:fldChar w:fldCharType="begin"/>
-            </w:r>
-            <w:r>
-              <w:rPr>
-                <w:webHidden/>
-              </w:rPr>
-              <w:instrText>PAGEREF _Toc56779026 \h</w:instrText>
-            </w:r>
-            <w:r>
-              <w:rPr>
-                <w:webHidden/>
-              </w:rPr>
-              <w:fldChar w:fldCharType="separate"/>
-            </w:r>
-            <w:r>
-              <w:rPr>
-                <w:rStyle w:val="IndexLink"/>
-                <w:vanish w:val="false"/>
-              </w:rPr>
               <w:tab/>
               <w:t>6</w:t>
-            </w:r>
-            <w:r>
-              <w:rPr>
-                <w:webHidden/>
-              </w:rPr>
-              <w:fldChar w:fldCharType="end"/>
             </w:r>
           </w:hyperlink>
         </w:p>
@@ -519,51 +339,19 @@
             <w:pStyle w:val="Contents3"/>
             <w:tabs>
               <w:tab w:val="clear" w:pos="720"/>
-              <w:tab w:val="right" w:pos="9016" w:leader="dot"/>
+              <w:tab w:val="right" w:pos="9026" w:leader="dot"/>
             </w:tabs>
-            <w:rPr>
-              <w:lang w:val="en-GB" w:eastAsia="en-GB"/>
-            </w:rPr>
+            <w:rPr/>
           </w:pPr>
-          <w:hyperlink w:anchor="_Toc56779027">
+          <w:hyperlink w:anchor="__RefHeading___Toc626_888842183">
             <w:r>
               <w:rPr>
                 <w:webHidden/>
                 <w:rStyle w:val="IndexLink"/>
               </w:rPr>
               <w:t>Drop</w:t>
-            </w:r>
-            <w:r>
-              <w:rPr>
-                <w:webHidden/>
-              </w:rPr>
-              <w:fldChar w:fldCharType="begin"/>
-            </w:r>
-            <w:r>
-              <w:rPr>
-                <w:webHidden/>
-              </w:rPr>
-              <w:instrText>PAGEREF _Toc56779027 \h</w:instrText>
-            </w:r>
-            <w:r>
-              <w:rPr>
-                <w:webHidden/>
-              </w:rPr>
-              <w:fldChar w:fldCharType="separate"/>
-            </w:r>
-            <w:r>
-              <w:rPr>
-                <w:rStyle w:val="IndexLink"/>
-                <w:vanish w:val="false"/>
-              </w:rPr>
               <w:tab/>
               <w:t>7</w:t>
-            </w:r>
-            <w:r>
-              <w:rPr>
-                <w:webHidden/>
-              </w:rPr>
-              <w:fldChar w:fldCharType="end"/>
             </w:r>
           </w:hyperlink>
         </w:p>
@@ -572,51 +360,19 @@
             <w:pStyle w:val="Contents3"/>
             <w:tabs>
               <w:tab w:val="clear" w:pos="720"/>
-              <w:tab w:val="right" w:pos="9016" w:leader="dot"/>
+              <w:tab w:val="right" w:pos="9026" w:leader="dot"/>
             </w:tabs>
-            <w:rPr>
-              <w:lang w:val="en-GB" w:eastAsia="en-GB"/>
-            </w:rPr>
+            <w:rPr/>
           </w:pPr>
-          <w:hyperlink w:anchor="_Toc56779028">
+          <w:hyperlink w:anchor="__RefHeading___Toc628_888842183">
             <w:r>
               <w:rPr>
                 <w:webHidden/>
                 <w:rStyle w:val="IndexLink"/>
               </w:rPr>
               <w:t>XML File Format</w:t>
-            </w:r>
-            <w:r>
-              <w:rPr>
-                <w:webHidden/>
-              </w:rPr>
-              <w:fldChar w:fldCharType="begin"/>
-            </w:r>
-            <w:r>
-              <w:rPr>
-                <w:webHidden/>
-              </w:rPr>
-              <w:instrText>PAGEREF _Toc56779028 \h</w:instrText>
-            </w:r>
-            <w:r>
-              <w:rPr>
-                <w:webHidden/>
-              </w:rPr>
-              <w:fldChar w:fldCharType="separate"/>
-            </w:r>
-            <w:r>
-              <w:rPr>
-                <w:rStyle w:val="IndexLink"/>
-                <w:vanish w:val="false"/>
-              </w:rPr>
               <w:tab/>
               <w:t>7</w:t>
-            </w:r>
-            <w:r>
-              <w:rPr>
-                <w:webHidden/>
-              </w:rPr>
-              <w:fldChar w:fldCharType="end"/>
             </w:r>
           </w:hyperlink>
         </w:p>
@@ -625,51 +381,19 @@
             <w:pStyle w:val="Contents3"/>
             <w:tabs>
               <w:tab w:val="clear" w:pos="720"/>
-              <w:tab w:val="right" w:pos="9016" w:leader="dot"/>
+              <w:tab w:val="right" w:pos="9026" w:leader="dot"/>
             </w:tabs>
-            <w:rPr>
-              <w:lang w:val="en-GB" w:eastAsia="en-GB"/>
-            </w:rPr>
+            <w:rPr/>
           </w:pPr>
-          <w:hyperlink w:anchor="_Toc56779029">
+          <w:hyperlink w:anchor="__RefHeading___Toc630_888842183">
             <w:r>
               <w:rPr>
                 <w:webHidden/>
                 <w:rStyle w:val="IndexLink"/>
               </w:rPr>
               <w:t>Merged Node Names</w:t>
-            </w:r>
-            <w:r>
-              <w:rPr>
-                <w:webHidden/>
-              </w:rPr>
-              <w:fldChar w:fldCharType="begin"/>
-            </w:r>
-            <w:r>
-              <w:rPr>
-                <w:webHidden/>
-              </w:rPr>
-              <w:instrText>PAGEREF _Toc56779029 \h</w:instrText>
-            </w:r>
-            <w:r>
-              <w:rPr>
-                <w:webHidden/>
-              </w:rPr>
-              <w:fldChar w:fldCharType="separate"/>
-            </w:r>
-            <w:r>
-              <w:rPr>
-                <w:rStyle w:val="IndexLink"/>
-                <w:vanish w:val="false"/>
-              </w:rPr>
               <w:tab/>
               <w:t>8</w:t>
-            </w:r>
-            <w:r>
-              <w:rPr>
-                <w:webHidden/>
-              </w:rPr>
-              <w:fldChar w:fldCharType="end"/>
             </w:r>
           </w:hyperlink>
         </w:p>
@@ -678,51 +402,19 @@
             <w:pStyle w:val="Contents2"/>
             <w:tabs>
               <w:tab w:val="clear" w:pos="720"/>
-              <w:tab w:val="right" w:pos="9016" w:leader="dot"/>
+              <w:tab w:val="right" w:pos="9026" w:leader="dot"/>
             </w:tabs>
-            <w:rPr>
-              <w:lang w:val="en-GB" w:eastAsia="en-GB"/>
-            </w:rPr>
+            <w:rPr/>
           </w:pPr>
-          <w:hyperlink w:anchor="_Toc56779030">
+          <w:hyperlink w:anchor="__RefHeading___Toc479_2825637425">
             <w:r>
               <w:rPr>
                 <w:webHidden/>
                 <w:rStyle w:val="IndexLink"/>
               </w:rPr>
               <w:t>Properties</w:t>
-            </w:r>
-            <w:r>
-              <w:rPr>
-                <w:webHidden/>
-              </w:rPr>
-              <w:fldChar w:fldCharType="begin"/>
-            </w:r>
-            <w:r>
-              <w:rPr>
-                <w:webHidden/>
-              </w:rPr>
-              <w:instrText>PAGEREF _Toc56779030 \h</w:instrText>
-            </w:r>
-            <w:r>
-              <w:rPr>
-                <w:webHidden/>
-              </w:rPr>
-              <w:fldChar w:fldCharType="separate"/>
-            </w:r>
-            <w:r>
-              <w:rPr>
-                <w:rStyle w:val="IndexLink"/>
-                <w:vanish w:val="false"/>
-              </w:rPr>
               <w:tab/>
               <w:t>9</w:t>
-            </w:r>
-            <w:r>
-              <w:rPr>
-                <w:webHidden/>
-              </w:rPr>
-              <w:fldChar w:fldCharType="end"/>
             </w:r>
           </w:hyperlink>
         </w:p>
@@ -731,51 +423,19 @@
             <w:pStyle w:val="Contents3"/>
             <w:tabs>
               <w:tab w:val="clear" w:pos="720"/>
-              <w:tab w:val="right" w:pos="9016" w:leader="dot"/>
+              <w:tab w:val="right" w:pos="9026" w:leader="dot"/>
             </w:tabs>
-            <w:rPr>
-              <w:lang w:val="en-GB" w:eastAsia="en-GB"/>
-            </w:rPr>
+            <w:rPr/>
           </w:pPr>
-          <w:hyperlink w:anchor="_Toc56779031">
+          <w:hyperlink w:anchor="__RefHeading___Toc897_1117627534">
             <w:r>
               <w:rPr>
                 <w:webHidden/>
                 <w:rStyle w:val="IndexLink"/>
               </w:rPr>
               <w:t>configurationFileLeft : QString</w:t>
-            </w:r>
-            <w:r>
-              <w:rPr>
-                <w:webHidden/>
-              </w:rPr>
-              <w:fldChar w:fldCharType="begin"/>
-            </w:r>
-            <w:r>
-              <w:rPr>
-                <w:webHidden/>
-              </w:rPr>
-              <w:instrText>PAGEREF _Toc56779031 \h</w:instrText>
-            </w:r>
-            <w:r>
-              <w:rPr>
-                <w:webHidden/>
-              </w:rPr>
-              <w:fldChar w:fldCharType="separate"/>
-            </w:r>
-            <w:r>
-              <w:rPr>
-                <w:rStyle w:val="IndexLink"/>
-                <w:vanish w:val="false"/>
-              </w:rPr>
               <w:tab/>
               <w:t>9</w:t>
-            </w:r>
-            <w:r>
-              <w:rPr>
-                <w:webHidden/>
-              </w:rPr>
-              <w:fldChar w:fldCharType="end"/>
             </w:r>
           </w:hyperlink>
         </w:p>
@@ -784,51 +444,19 @@
             <w:pStyle w:val="Contents3"/>
             <w:tabs>
               <w:tab w:val="clear" w:pos="720"/>
-              <w:tab w:val="right" w:pos="9016" w:leader="dot"/>
+              <w:tab w:val="right" w:pos="9026" w:leader="dot"/>
             </w:tabs>
-            <w:rPr>
-              <w:lang w:val="en-GB" w:eastAsia="en-GB"/>
-            </w:rPr>
+            <w:rPr/>
           </w:pPr>
-          <w:hyperlink w:anchor="_Toc56779032">
+          <w:hyperlink w:anchor="__RefHeading___Toc632_888842183">
             <w:r>
               <w:rPr>
                 <w:webHidden/>
                 <w:rStyle w:val="IndexLink"/>
               </w:rPr>
               <w:t>configurationFileRight : QString</w:t>
-            </w:r>
-            <w:r>
-              <w:rPr>
-                <w:webHidden/>
-              </w:rPr>
-              <w:fldChar w:fldCharType="begin"/>
-            </w:r>
-            <w:r>
-              <w:rPr>
-                <w:webHidden/>
-              </w:rPr>
-              <w:instrText>PAGEREF _Toc56779032 \h</w:instrText>
-            </w:r>
-            <w:r>
-              <w:rPr>
-                <w:webHidden/>
-              </w:rPr>
-              <w:fldChar w:fldCharType="separate"/>
-            </w:r>
-            <w:r>
-              <w:rPr>
-                <w:rStyle w:val="IndexLink"/>
-                <w:vanish w:val="false"/>
-              </w:rPr>
               <w:tab/>
               <w:t>9</w:t>
-            </w:r>
-            <w:r>
-              <w:rPr>
-                <w:webHidden/>
-              </w:rPr>
-              <w:fldChar w:fldCharType="end"/>
             </w:r>
           </w:hyperlink>
         </w:p>
@@ -837,51 +465,19 @@
             <w:pStyle w:val="Contents3"/>
             <w:tabs>
               <w:tab w:val="clear" w:pos="720"/>
-              <w:tab w:val="right" w:pos="9016" w:leader="dot"/>
+              <w:tab w:val="right" w:pos="9026" w:leader="dot"/>
             </w:tabs>
-            <w:rPr>
-              <w:lang w:val="en-GB" w:eastAsia="en-GB"/>
-            </w:rPr>
+            <w:rPr/>
           </w:pPr>
-          <w:hyperlink w:anchor="_Toc56779033">
+          <w:hyperlink w:anchor="__RefHeading___Toc634_888842183">
             <w:r>
               <w:rPr>
                 <w:webHidden/>
                 <w:rStyle w:val="IndexLink"/>
               </w:rPr>
               <w:t>defaultSubstitutions : QString</w:t>
-            </w:r>
-            <w:r>
-              <w:rPr>
-                <w:webHidden/>
-              </w:rPr>
-              <w:fldChar w:fldCharType="begin"/>
-            </w:r>
-            <w:r>
-              <w:rPr>
-                <w:webHidden/>
-              </w:rPr>
-              <w:instrText>PAGEREF _Toc56779033 \h</w:instrText>
-            </w:r>
-            <w:r>
-              <w:rPr>
-                <w:webHidden/>
-              </w:rPr>
-              <w:fldChar w:fldCharType="separate"/>
-            </w:r>
-            <w:r>
-              <w:rPr>
-                <w:rStyle w:val="IndexLink"/>
-                <w:vanish w:val="false"/>
-              </w:rPr>
               <w:tab/>
               <w:t>9</w:t>
-            </w:r>
-            <w:r>
-              <w:rPr>
-                <w:webHidden/>
-              </w:rPr>
-              <w:fldChar w:fldCharType="end"/>
             </w:r>
           </w:hyperlink>
         </w:p>
@@ -890,51 +486,19 @@
             <w:pStyle w:val="Contents3"/>
             <w:tabs>
               <w:tab w:val="clear" w:pos="720"/>
-              <w:tab w:val="right" w:pos="9016" w:leader="dot"/>
+              <w:tab w:val="right" w:pos="9026" w:leader="dot"/>
             </w:tabs>
-            <w:rPr>
-              <w:lang w:val="en-GB" w:eastAsia="en-GB"/>
-            </w:rPr>
+            <w:rPr/>
           </w:pPr>
-          <w:hyperlink w:anchor="_Toc56779034">
+          <w:hyperlink w:anchor="__RefHeading___Toc636_888842183">
             <w:r>
               <w:rPr>
                 <w:webHidden/>
                 <w:rStyle w:val="IndexLink"/>
               </w:rPr>
               <w:t>defaultDir : QString</w:t>
-            </w:r>
-            <w:r>
-              <w:rPr>
-                <w:webHidden/>
-              </w:rPr>
-              <w:fldChar w:fldCharType="begin"/>
-            </w:r>
-            <w:r>
-              <w:rPr>
-                <w:webHidden/>
-              </w:rPr>
-              <w:instrText>PAGEREF _Toc56779034 \h</w:instrText>
-            </w:r>
-            <w:r>
-              <w:rPr>
-                <w:webHidden/>
-              </w:rPr>
-              <w:fldChar w:fldCharType="separate"/>
-            </w:r>
-            <w:r>
-              <w:rPr>
-                <w:rStyle w:val="IndexLink"/>
-                <w:vanish w:val="false"/>
-              </w:rPr>
               <w:tab/>
               <w:t>9</w:t>
-            </w:r>
-            <w:r>
-              <w:rPr>
-                <w:webHidden/>
-              </w:rPr>
-              <w:fldChar w:fldCharType="end"/>
             </w:r>
           </w:hyperlink>
         </w:p>
@@ -943,51 +507,19 @@
             <w:pStyle w:val="Contents3"/>
             <w:tabs>
               <w:tab w:val="clear" w:pos="720"/>
-              <w:tab w:val="right" w:pos="9016" w:leader="dot"/>
+              <w:tab w:val="right" w:pos="9026" w:leader="dot"/>
             </w:tabs>
-            <w:rPr>
-              <w:lang w:val="en-GB" w:eastAsia="en-GB"/>
-            </w:rPr>
+            <w:rPr/>
           </w:pPr>
-          <w:hyperlink w:anchor="_Toc56779035">
+          <w:hyperlink w:anchor="__RefHeading___Toc638_888842183">
             <w:r>
               <w:rPr>
                 <w:webHidden/>
                 <w:rStyle w:val="IndexLink"/>
               </w:rPr>
               <w:t>confirmAction : bool</w:t>
-            </w:r>
-            <w:r>
-              <w:rPr>
-                <w:webHidden/>
-              </w:rPr>
-              <w:fldChar w:fldCharType="begin"/>
-            </w:r>
-            <w:r>
-              <w:rPr>
-                <w:webHidden/>
-              </w:rPr>
-              <w:instrText>PAGEREF _Toc56779035 \h</w:instrText>
-            </w:r>
-            <w:r>
-              <w:rPr>
-                <w:webHidden/>
-              </w:rPr>
-              <w:fldChar w:fldCharType="separate"/>
-            </w:r>
-            <w:r>
-              <w:rPr>
-                <w:rStyle w:val="IndexLink"/>
-                <w:vanish w:val="false"/>
-              </w:rPr>
               <w:tab/>
               <w:t>9</w:t>
-            </w:r>
-            <w:r>
-              <w:rPr>
-                <w:webHidden/>
-              </w:rPr>
-              <w:fldChar w:fldCharType="end"/>
             </w:r>
           </w:hyperlink>
         </w:p>
@@ -996,51 +528,19 @@
             <w:pStyle w:val="Contents1"/>
             <w:tabs>
               <w:tab w:val="clear" w:pos="720"/>
-              <w:tab w:val="right" w:pos="9016" w:leader="dot"/>
+              <w:tab w:val="right" w:pos="9026" w:leader="dot"/>
             </w:tabs>
-            <w:rPr>
-              <w:lang w:val="en-GB" w:eastAsia="en-GB"/>
-            </w:rPr>
+            <w:rPr/>
           </w:pPr>
-          <w:hyperlink w:anchor="_Toc56779036">
+          <w:hyperlink w:anchor="__RefHeading___Toc640_888842183">
             <w:r>
               <w:rPr>
                 <w:webHidden/>
                 <w:rStyle w:val="IndexLink"/>
               </w:rPr>
               <w:t>QEPvLoadSaveButton</w:t>
-            </w:r>
-            <w:r>
-              <w:rPr>
-                <w:webHidden/>
-              </w:rPr>
-              <w:fldChar w:fldCharType="begin"/>
-            </w:r>
-            <w:r>
-              <w:rPr>
-                <w:webHidden/>
-              </w:rPr>
-              <w:instrText>PAGEREF _Toc56779036 \h</w:instrText>
-            </w:r>
-            <w:r>
-              <w:rPr>
-                <w:webHidden/>
-              </w:rPr>
-              <w:fldChar w:fldCharType="separate"/>
-            </w:r>
-            <w:r>
-              <w:rPr>
-                <w:rStyle w:val="IndexLink"/>
-                <w:vanish w:val="false"/>
-              </w:rPr>
               <w:tab/>
               <w:t>10</w:t>
-            </w:r>
-            <w:r>
-              <w:rPr>
-                <w:webHidden/>
-              </w:rPr>
-              <w:fldChar w:fldCharType="end"/>
             </w:r>
           </w:hyperlink>
         </w:p>
@@ -1049,51 +549,19 @@
             <w:pStyle w:val="Contents2"/>
             <w:tabs>
               <w:tab w:val="clear" w:pos="720"/>
-              <w:tab w:val="right" w:pos="9016" w:leader="dot"/>
+              <w:tab w:val="right" w:pos="9026" w:leader="dot"/>
             </w:tabs>
-            <w:rPr>
-              <w:lang w:val="en-GB" w:eastAsia="en-GB"/>
-            </w:rPr>
+            <w:rPr/>
           </w:pPr>
-          <w:hyperlink w:anchor="_Toc56779037">
+          <w:hyperlink w:anchor="__RefHeading___Toc502_2825637425">
             <w:r>
               <w:rPr>
                 <w:webHidden/>
                 <w:rStyle w:val="IndexLink"/>
               </w:rPr>
               <w:t>Description</w:t>
-            </w:r>
-            <w:r>
-              <w:rPr>
-                <w:webHidden/>
-              </w:rPr>
-              <w:fldChar w:fldCharType="begin"/>
-            </w:r>
-            <w:r>
-              <w:rPr>
-                <w:webHidden/>
-              </w:rPr>
-              <w:instrText>PAGEREF _Toc56779037 \h</w:instrText>
-            </w:r>
-            <w:r>
-              <w:rPr>
-                <w:webHidden/>
-              </w:rPr>
-              <w:fldChar w:fldCharType="separate"/>
-            </w:r>
-            <w:r>
-              <w:rPr>
-                <w:rStyle w:val="IndexLink"/>
-                <w:vanish w:val="false"/>
-              </w:rPr>
               <w:tab/>
               <w:t>10</w:t>
-            </w:r>
-            <w:r>
-              <w:rPr>
-                <w:webHidden/>
-              </w:rPr>
-              <w:fldChar w:fldCharType="end"/>
             </w:r>
           </w:hyperlink>
         </w:p>
@@ -1102,51 +570,19 @@
             <w:pStyle w:val="Contents2"/>
             <w:tabs>
               <w:tab w:val="clear" w:pos="720"/>
-              <w:tab w:val="right" w:pos="9016" w:leader="dot"/>
+              <w:tab w:val="right" w:pos="9026" w:leader="dot"/>
             </w:tabs>
-            <w:rPr>
-              <w:lang w:val="en-GB" w:eastAsia="en-GB"/>
-            </w:rPr>
+            <w:rPr/>
           </w:pPr>
-          <w:hyperlink w:anchor="_Toc56779038">
+          <w:hyperlink w:anchor="__RefHeading___Toc642_888842183">
             <w:r>
               <w:rPr>
                 <w:webHidden/>
                 <w:rStyle w:val="IndexLink"/>
               </w:rPr>
               <w:t>Properties</w:t>
-            </w:r>
-            <w:r>
-              <w:rPr>
-                <w:webHidden/>
-              </w:rPr>
-              <w:fldChar w:fldCharType="begin"/>
-            </w:r>
-            <w:r>
-              <w:rPr>
-                <w:webHidden/>
-              </w:rPr>
-              <w:instrText>PAGEREF _Toc56779038 \h</w:instrText>
-            </w:r>
-            <w:r>
-              <w:rPr>
-                <w:webHidden/>
-              </w:rPr>
-              <w:fldChar w:fldCharType="separate"/>
-            </w:r>
-            <w:r>
-              <w:rPr>
-                <w:rStyle w:val="IndexLink"/>
-                <w:vanish w:val="false"/>
-              </w:rPr>
               <w:tab/>
               <w:t>10</w:t>
-            </w:r>
-            <w:r>
-              <w:rPr>
-                <w:webHidden/>
-              </w:rPr>
-              <w:fldChar w:fldCharType="end"/>
             </w:r>
           </w:hyperlink>
         </w:p>
@@ -1155,51 +591,19 @@
             <w:pStyle w:val="Contents3"/>
             <w:tabs>
               <w:tab w:val="clear" w:pos="720"/>
-              <w:tab w:val="right" w:pos="9016" w:leader="dot"/>
+              <w:tab w:val="right" w:pos="9026" w:leader="dot"/>
             </w:tabs>
-            <w:rPr>
-              <w:lang w:val="en-GB" w:eastAsia="en-GB"/>
-            </w:rPr>
+            <w:rPr/>
           </w:pPr>
-          <w:hyperlink w:anchor="_Toc56779039">
+          <w:hyperlink w:anchor="__RefHeading___Toc644_888842183">
             <w:r>
               <w:rPr>
                 <w:webHidden/>
                 <w:rStyle w:val="IndexLink"/>
               </w:rPr>
               <w:t>configurationFile : QString</w:t>
-            </w:r>
-            <w:r>
-              <w:rPr>
-                <w:webHidden/>
-              </w:rPr>
-              <w:fldChar w:fldCharType="begin"/>
-            </w:r>
-            <w:r>
-              <w:rPr>
-                <w:webHidden/>
-              </w:rPr>
-              <w:instrText>PAGEREF _Toc56779039 \h</w:instrText>
-            </w:r>
-            <w:r>
-              <w:rPr>
-                <w:webHidden/>
-              </w:rPr>
-              <w:fldChar w:fldCharType="separate"/>
-            </w:r>
-            <w:r>
-              <w:rPr>
-                <w:rStyle w:val="IndexLink"/>
-                <w:vanish w:val="false"/>
-              </w:rPr>
               <w:tab/>
               <w:t>10</w:t>
-            </w:r>
-            <w:r>
-              <w:rPr>
-                <w:webHidden/>
-              </w:rPr>
-              <w:fldChar w:fldCharType="end"/>
             </w:r>
           </w:hyperlink>
         </w:p>
@@ -1208,51 +612,19 @@
             <w:pStyle w:val="Contents3"/>
             <w:tabs>
               <w:tab w:val="clear" w:pos="720"/>
-              <w:tab w:val="right" w:pos="9016" w:leader="dot"/>
+              <w:tab w:val="right" w:pos="9026" w:leader="dot"/>
             </w:tabs>
-            <w:rPr>
-              <w:lang w:val="en-GB" w:eastAsia="en-GB"/>
-            </w:rPr>
+            <w:rPr/>
           </w:pPr>
-          <w:hyperlink w:anchor="_Toc56779040">
+          <w:hyperlink w:anchor="__RefHeading___Toc646_888842183">
             <w:r>
               <w:rPr>
                 <w:webHidden/>
                 <w:rStyle w:val="IndexLink"/>
               </w:rPr>
               <w:t>defaultSubstitutions : QString</w:t>
-            </w:r>
-            <w:r>
-              <w:rPr>
-                <w:webHidden/>
-              </w:rPr>
-              <w:fldChar w:fldCharType="begin"/>
-            </w:r>
-            <w:r>
-              <w:rPr>
-                <w:webHidden/>
-              </w:rPr>
-              <w:instrText>PAGEREF _Toc56779040 \h</w:instrText>
-            </w:r>
-            <w:r>
-              <w:rPr>
-                <w:webHidden/>
-              </w:rPr>
-              <w:fldChar w:fldCharType="separate"/>
-            </w:r>
-            <w:r>
-              <w:rPr>
-                <w:rStyle w:val="IndexLink"/>
-                <w:vanish w:val="false"/>
-              </w:rPr>
               <w:tab/>
               <w:t>10</w:t>
-            </w:r>
-            <w:r>
-              <w:rPr>
-                <w:webHidden/>
-              </w:rPr>
-              <w:fldChar w:fldCharType="end"/>
             </w:r>
           </w:hyperlink>
         </w:p>
@@ -1261,51 +633,19 @@
             <w:pStyle w:val="Contents3"/>
             <w:tabs>
               <w:tab w:val="clear" w:pos="720"/>
-              <w:tab w:val="right" w:pos="9016" w:leader="dot"/>
+              <w:tab w:val="right" w:pos="9026" w:leader="dot"/>
             </w:tabs>
-            <w:rPr>
-              <w:lang w:val="en-GB" w:eastAsia="en-GB"/>
-            </w:rPr>
+            <w:rPr/>
           </w:pPr>
-          <w:hyperlink w:anchor="_Toc56779041">
+          <w:hyperlink w:anchor="__RefHeading___Toc648_888842183">
             <w:r>
               <w:rPr>
                 <w:webHidden/>
                 <w:rStyle w:val="IndexLink"/>
               </w:rPr>
               <w:t>action : enumeration</w:t>
-            </w:r>
-            <w:r>
-              <w:rPr>
-                <w:webHidden/>
-              </w:rPr>
-              <w:fldChar w:fldCharType="begin"/>
-            </w:r>
-            <w:r>
-              <w:rPr>
-                <w:webHidden/>
-              </w:rPr>
-              <w:instrText>PAGEREF _Toc56779041 \h</w:instrText>
-            </w:r>
-            <w:r>
-              <w:rPr>
-                <w:webHidden/>
-              </w:rPr>
-              <w:fldChar w:fldCharType="separate"/>
-            </w:r>
-            <w:r>
-              <w:rPr>
-                <w:rStyle w:val="IndexLink"/>
-                <w:vanish w:val="false"/>
-              </w:rPr>
               <w:tab/>
               <w:t>10</w:t>
-            </w:r>
-            <w:r>
-              <w:rPr>
-                <w:webHidden/>
-              </w:rPr>
-              <w:fldChar w:fldCharType="end"/>
             </w:r>
           </w:hyperlink>
         </w:p>
@@ -1314,51 +654,19 @@
             <w:pStyle w:val="Contents3"/>
             <w:tabs>
               <w:tab w:val="clear" w:pos="720"/>
-              <w:tab w:val="right" w:pos="9016" w:leader="dot"/>
+              <w:tab w:val="right" w:pos="9026" w:leader="dot"/>
             </w:tabs>
-            <w:rPr>
-              <w:lang w:val="en-GB" w:eastAsia="en-GB"/>
-            </w:rPr>
+            <w:rPr/>
           </w:pPr>
-          <w:hyperlink w:anchor="_Toc56779042">
+          <w:hyperlink w:anchor="__RefHeading___Toc650_888842183">
             <w:r>
               <w:rPr>
                 <w:webHidden/>
                 <w:rStyle w:val="IndexLink"/>
               </w:rPr>
               <w:t>confirmAction : bool</w:t>
-            </w:r>
-            <w:r>
-              <w:rPr>
-                <w:webHidden/>
-              </w:rPr>
-              <w:fldChar w:fldCharType="begin"/>
-            </w:r>
-            <w:r>
-              <w:rPr>
-                <w:webHidden/>
-              </w:rPr>
-              <w:instrText>PAGEREF _Toc56779042 \h</w:instrText>
-            </w:r>
-            <w:r>
-              <w:rPr>
-                <w:webHidden/>
-              </w:rPr>
-              <w:fldChar w:fldCharType="separate"/>
-            </w:r>
-            <w:r>
-              <w:rPr>
-                <w:rStyle w:val="IndexLink"/>
-                <w:vanish w:val="false"/>
-              </w:rPr>
               <w:tab/>
               <w:t>10</w:t>
-            </w:r>
-            <w:r>
-              <w:rPr>
-                <w:webHidden/>
-              </w:rPr>
-              <w:fldChar w:fldCharType="end"/>
             </w:r>
           </w:hyperlink>
         </w:p>
@@ -1367,51 +675,19 @@
             <w:pStyle w:val="Contents3"/>
             <w:tabs>
               <w:tab w:val="clear" w:pos="720"/>
-              <w:tab w:val="right" w:pos="9016" w:leader="dot"/>
+              <w:tab w:val="right" w:pos="9026" w:leader="dot"/>
             </w:tabs>
-            <w:rPr>
-              <w:lang w:val="en-GB" w:eastAsia="en-GB"/>
-            </w:rPr>
+            <w:rPr/>
           </w:pPr>
-          <w:hyperlink w:anchor="_Toc56779043">
+          <w:hyperlink w:anchor="__RefHeading___Toc652_888842183">
             <w:r>
               <w:rPr>
                 <w:webHidden/>
                 <w:rStyle w:val="IndexLink"/>
               </w:rPr>
               <w:t>confirmText : QString</w:t>
-            </w:r>
-            <w:r>
-              <w:rPr>
-                <w:webHidden/>
-              </w:rPr>
-              <w:fldChar w:fldCharType="begin"/>
-            </w:r>
-            <w:r>
-              <w:rPr>
-                <w:webHidden/>
-              </w:rPr>
-              <w:instrText>PAGEREF _Toc56779043 \h</w:instrText>
-            </w:r>
-            <w:r>
-              <w:rPr>
-                <w:webHidden/>
-              </w:rPr>
-              <w:fldChar w:fldCharType="separate"/>
-            </w:r>
-            <w:r>
-              <w:rPr>
-                <w:rStyle w:val="IndexLink"/>
-                <w:vanish w:val="false"/>
-              </w:rPr>
               <w:tab/>
               <w:t>10</w:t>
-            </w:r>
-            <w:r>
-              <w:rPr>
-                <w:webHidden/>
-              </w:rPr>
-              <w:fldChar w:fldCharType="end"/>
             </w:r>
           </w:hyperlink>
         </w:p>
@@ -1420,64 +696,25 @@
             <w:pStyle w:val="Contents3"/>
             <w:tabs>
               <w:tab w:val="clear" w:pos="720"/>
-              <w:tab w:val="right" w:pos="9016" w:leader="dot"/>
+              <w:tab w:val="right" w:pos="9026" w:leader="dot"/>
             </w:tabs>
-            <w:rPr>
-              <w:lang w:val="en-GB" w:eastAsia="en-GB"/>
-            </w:rPr>
+            <w:rPr/>
           </w:pPr>
-          <w:hyperlink w:anchor="_Toc56779044">
+          <w:hyperlink w:anchor="__RefHeading___Toc654_888842183">
             <w:r>
               <w:rPr>
                 <w:webHidden/>
                 <w:rStyle w:val="IndexLink"/>
               </w:rPr>
               <w:t>showProgressBar : bool</w:t>
-            </w:r>
-            <w:r>
-              <w:rPr>
-                <w:webHidden/>
-              </w:rPr>
-              <w:fldChar w:fldCharType="begin"/>
-            </w:r>
-            <w:r>
-              <w:rPr>
-                <w:webHidden/>
-              </w:rPr>
-              <w:instrText>PAGEREF _Toc56779044 \h</w:instrText>
-            </w:r>
-            <w:r>
-              <w:rPr>
-                <w:webHidden/>
-              </w:rPr>
-              <w:fldChar w:fldCharType="separate"/>
-            </w:r>
-            <w:r>
-              <w:rPr>
-                <w:rStyle w:val="IndexLink"/>
-                <w:vanish w:val="false"/>
-              </w:rPr>
               <w:tab/>
               <w:t>10</w:t>
             </w:r>
-            <w:r>
-              <w:rPr>
-                <w:webHidden/>
-              </w:rPr>
-              <w:fldChar w:fldCharType="end"/>
-            </w:r>
           </w:hyperlink>
-        </w:p>
-        <w:p>
-          <w:pPr>
-            <w:pStyle w:val="Normal"/>
-            <w:rPr/>
-          </w:pPr>
           <w:r>
-            <w:rPr/>
-          </w:r>
-          <w:r>
-            <w:rPr/>
+            <w:rPr>
+              <w:rStyle w:val="IndexLink"/>
+            </w:rPr>
             <w:fldChar w:fldCharType="end"/>
           </w:r>
         </w:p>
@@ -1502,14 +739,16 @@
         <w:pStyle w:val="Heading1"/>
         <w:rPr/>
       </w:pPr>
-      <w:bookmarkStart w:id="0" w:name="_Toc56779022"/>
+      <w:bookmarkStart w:id="0" w:name="__RefHeading___Toc620_888842183"/>
       <w:bookmarkStart w:id="1" w:name="_Ref342384189"/>
+      <w:bookmarkStart w:id="2" w:name="_Toc56779022"/>
+      <w:bookmarkEnd w:id="0"/>
       <w:r>
         <w:rPr/>
         <w:t>Introduction</w:t>
       </w:r>
-      <w:bookmarkEnd w:id="0"/>
       <w:bookmarkEnd w:id="1"/>
+      <w:bookmarkEnd w:id="2"/>
     </w:p>
     <w:p>
       <w:pPr>
@@ -1554,28 +793,28 @@
         <w:pStyle w:val="Heading1"/>
         <w:rPr/>
       </w:pPr>
-      <w:bookmarkStart w:id="2" w:name="__RefHeading___Toc477_2825637425"/>
-      <w:bookmarkStart w:id="3" w:name="_Toc56779023"/>
-      <w:bookmarkEnd w:id="2"/>
+      <w:bookmarkStart w:id="3" w:name="__RefHeading___Toc477_2825637425"/>
+      <w:bookmarkStart w:id="4" w:name="_Toc56779023"/>
+      <w:bookmarkEnd w:id="3"/>
       <w:r>
         <w:rPr/>
         <w:t>QEPvLoadSave</w:t>
       </w:r>
-      <w:bookmarkEnd w:id="3"/>
+      <w:bookmarkEnd w:id="4"/>
     </w:p>
     <w:p>
       <w:pPr>
         <w:pStyle w:val="Heading2"/>
         <w:rPr/>
       </w:pPr>
-      <w:bookmarkStart w:id="4" w:name="__RefHeading___Toc500_2825637425"/>
-      <w:bookmarkStart w:id="5" w:name="_Toc56779024"/>
-      <w:bookmarkEnd w:id="4"/>
+      <w:bookmarkStart w:id="5" w:name="__RefHeading___Toc500_2825637425"/>
+      <w:bookmarkStart w:id="6" w:name="_Toc56779024"/>
+      <w:bookmarkEnd w:id="5"/>
       <w:r>
         <w:rPr/>
         <w:t>Description</w:t>
       </w:r>
-      <w:bookmarkEnd w:id="5"/>
+      <w:bookmarkEnd w:id="6"/>
     </w:p>
     <w:p>
       <w:pPr>
@@ -1748,7 +987,7 @@
     <w:p>
       <w:pPr>
         <w:pStyle w:val="ListParagraph"/>
-        <w:ind w:hanging="0"/>
+        <w:ind w:left="720" w:hanging="0"/>
         <w:jc w:val="both"/>
         <w:rPr/>
       </w:pPr>
@@ -1760,7 +999,7 @@
     <w:p>
       <w:pPr>
         <w:pStyle w:val="ListParagraph"/>
-        <w:ind w:hanging="0"/>
+        <w:ind w:left="720" w:hanging="0"/>
         <w:jc w:val="both"/>
         <w:rPr/>
       </w:pPr>
@@ -1781,7 +1020,7 @@
     <w:p>
       <w:pPr>
         <w:pStyle w:val="ListParagraph"/>
-        <w:ind w:hanging="0"/>
+        <w:ind w:left="720" w:hanging="0"/>
         <w:jc w:val="both"/>
         <w:rPr/>
       </w:pPr>
@@ -1793,7 +1032,7 @@
     <w:p>
       <w:pPr>
         <w:pStyle w:val="ListParagraph"/>
-        <w:ind w:hanging="0"/>
+        <w:ind w:left="720" w:hanging="0"/>
         <w:jc w:val="both"/>
         <w:rPr/>
       </w:pPr>
@@ -1805,7 +1044,7 @@
     <w:p>
       <w:pPr>
         <w:pStyle w:val="ListParagraph"/>
-        <w:ind w:hanging="0"/>
+        <w:ind w:left="720" w:hanging="0"/>
         <w:jc w:val="both"/>
         <w:rPr/>
       </w:pPr>
@@ -1816,17 +1055,13 @@
     <w:p>
       <w:pPr>
         <w:pStyle w:val="ListParagraph"/>
-        <w:ind w:hanging="0"/>
+        <w:ind w:left="720" w:hanging="0"/>
         <w:jc w:val="both"/>
         <w:rPr/>
       </w:pPr>
       <w:r>
         <w:rPr/>
-        <w:t xml:space="preserve">A comment may also be associated  with the hierarchical set of variables </w:t>
-      </w:r>
-      <w:r>
-        <w:rPr/>
-        <w:t>and values which is saved within the stored xml file and read from the xml file when loaded.</w:t>
+        <w:t>A comment may also be associated  with the hierarchical set of variables and values which is saved within the stored xml file and read from the xml file when loaded.</w:t>
       </w:r>
     </w:p>
     <w:p>
@@ -1962,8 +1197,8 @@
         <w:jc w:val="center"/>
         <w:rPr/>
       </w:pPr>
-      <w:bookmarkStart w:id="6" w:name="_Ref370132662"/>
-      <w:bookmarkStart w:id="7" w:name="_Ref370132660"/>
+      <w:bookmarkStart w:id="7" w:name="_Ref370132662"/>
+      <w:bookmarkStart w:id="8" w:name="_Ref370132660"/>
       <w:r>
         <w:rPr/>
         <w:t xml:space="preserve">Figure </w:t>
@@ -1988,12 +1223,12 @@
         <w:rPr/>
         <w:fldChar w:fldCharType="end"/>
       </w:r>
+      <w:bookmarkEnd w:id="8"/>
+      <w:r>
+        <w:rPr/>
+        <w:t xml:space="preserve"> QEPvLoadSave – basic example.</w:t>
+      </w:r>
       <w:bookmarkEnd w:id="7"/>
-      <w:r>
-        <w:rPr/>
-        <w:t xml:space="preserve"> QEPvLoadSave – basic example.</w:t>
-      </w:r>
-      <w:bookmarkEnd w:id="6"/>
     </w:p>
     <w:p>
       <w:pPr>
@@ -2009,14 +1244,16 @@
         <w:pStyle w:val="Heading3"/>
         <w:rPr/>
       </w:pPr>
-      <w:bookmarkStart w:id="8" w:name="_Toc56779025"/>
-      <w:bookmarkStart w:id="9" w:name="_Toc46494751"/>
+      <w:bookmarkStart w:id="9" w:name="__RefHeading___Toc622_888842183"/>
+      <w:bookmarkStart w:id="10" w:name="_Toc46494751"/>
+      <w:bookmarkStart w:id="11" w:name="_Toc56779025"/>
+      <w:bookmarkEnd w:id="9"/>
       <w:r>
         <w:rPr/>
         <w:t>Tool Bar</w:t>
       </w:r>
-      <w:bookmarkEnd w:id="8"/>
-      <w:bookmarkEnd w:id="9"/>
+      <w:bookmarkEnd w:id="10"/>
+      <w:bookmarkEnd w:id="11"/>
     </w:p>
     <w:p>
       <w:pPr>
@@ -2809,8 +2046,8 @@
         <w:jc w:val="center"/>
         <w:rPr/>
       </w:pPr>
-      <w:bookmarkStart w:id="10" w:name="_Ref370135586"/>
-      <w:bookmarkStart w:id="11" w:name="_Ref370135585"/>
+      <w:bookmarkStart w:id="12" w:name="_Ref370135586"/>
+      <w:bookmarkStart w:id="13" w:name="_Ref370135585"/>
       <w:r>
         <w:rPr/>
         <w:t xml:space="preserve">Figure </w:t>
@@ -2835,26 +2072,28 @@
         <w:rPr/>
         <w:fldChar w:fldCharType="end"/>
       </w:r>
-      <w:bookmarkEnd w:id="11"/>
+      <w:bookmarkEnd w:id="13"/>
       <w:r>
         <w:rPr/>
         <w:t xml:space="preserve"> QEPvLoadSave – context menu example.</w:t>
       </w:r>
-      <w:bookmarkEnd w:id="10"/>
+      <w:bookmarkEnd w:id="12"/>
     </w:p>
     <w:p>
       <w:pPr>
         <w:pStyle w:val="Heading3"/>
         <w:rPr/>
       </w:pPr>
-      <w:bookmarkStart w:id="12" w:name="_Toc56779026"/>
-      <w:bookmarkStart w:id="13" w:name="_Toc46494752"/>
+      <w:bookmarkStart w:id="14" w:name="__RefHeading___Toc624_888842183"/>
+      <w:bookmarkStart w:id="15" w:name="_Toc46494752"/>
+      <w:bookmarkStart w:id="16" w:name="_Toc56779026"/>
+      <w:bookmarkEnd w:id="14"/>
       <w:r>
         <w:rPr/>
         <w:t>Context Menu</w:t>
       </w:r>
-      <w:bookmarkEnd w:id="12"/>
-      <w:bookmarkEnd w:id="13"/>
+      <w:bookmarkEnd w:id="15"/>
+      <w:bookmarkEnd w:id="16"/>
     </w:p>
     <w:p>
       <w:pPr>
@@ -3006,6 +2245,7 @@
     <w:p>
       <w:pPr>
         <w:pStyle w:val="ListParagraph"/>
+        <w:jc w:val="both"/>
         <w:rPr/>
       </w:pPr>
       <w:r>
@@ -3024,8 +2264,16 @@
       </w:pPr>
       <w:r>
         <w:rPr/>
-        <w:t>Edit PV Name... This allows the PV name to be modified. It is only available if a PV node is selected;</w:t>
-        <w:br/>
+        <w:t>Add Pause Delay (not shown in example). This add a 5 second pause/delay when writing,</w:t>
+      </w:r>
+    </w:p>
+    <w:p>
+      <w:pPr>
+        <w:pStyle w:val="ListParagraph"/>
+        <w:rPr/>
+      </w:pPr>
+      <w:r>
+        <w:rPr/>
       </w:r>
     </w:p>
     <w:p>
@@ -3040,12 +2288,33 @@
       </w:pPr>
       <w:r>
         <w:rPr/>
+        <w:t>Edit PV Name... This allows the PV name to be modified. It is only available if a PV node is selected;</w:t>
+        <w:br/>
+      </w:r>
+    </w:p>
+    <w:p>
+      <w:pPr>
+        <w:pStyle w:val="ListParagraph"/>
+        <w:numPr>
+          <w:ilvl w:val="0"/>
+          <w:numId w:val="3"/>
+        </w:numPr>
+        <w:jc w:val="both"/>
+        <w:rPr/>
+      </w:pPr>
+      <w:r>
+        <w:rPr/>
         <w:t>Edit PV Value....  This allows the user to edit the value(s) of the selected PV - is essentially the same as using the edit button as described above.</w:t>
       </w:r>
     </w:p>
     <w:p>
       <w:pPr>
         <w:pStyle w:val="ListParagraph"/>
+        <w:numPr>
+          <w:ilvl w:val="0"/>
+          <w:numId w:val="0"/>
+        </w:numPr>
+        <w:ind w:left="1440" w:hanging="0"/>
         <w:jc w:val="both"/>
         <w:rPr/>
       </w:pPr>
@@ -3055,57 +2324,102 @@
     </w:p>
     <w:p>
       <w:pPr>
+        <w:pStyle w:val="ListParagraph"/>
+        <w:numPr>
+          <w:ilvl w:val="0"/>
+          <w:numId w:val="3"/>
+        </w:numPr>
+        <w:jc w:val="both"/>
+        <w:rPr/>
+      </w:pPr>
+      <w:r>
+        <w:rPr/>
+        <w:t xml:space="preserve">Edit Pause Delay…  This allows the user to edit the delay value. </w:t>
+      </w:r>
+      <w:r>
+        <w:rPr>
+          <w:i/>
+          <w:iCs/>
+        </w:rPr>
+        <w:t>Note</w:t>
+      </w:r>
+      <w:r>
+        <w:rPr/>
+        <w:t>: it currently re-purposes the PV edit value dialogue – not ideal, but good enough for now.</w:t>
+      </w:r>
+    </w:p>
+    <w:p>
+      <w:pPr>
+        <w:pStyle w:val="ListParagraph"/>
+        <w:numPr>
+          <w:ilvl w:val="0"/>
+          <w:numId w:val="0"/>
+        </w:numPr>
+        <w:ind w:left="1440" w:hanging="0"/>
+        <w:jc w:val="both"/>
+        <w:rPr/>
+      </w:pPr>
+      <w:r>
+        <w:rPr/>
+      </w:r>
+    </w:p>
+    <w:p>
+      <w:pPr>
         <w:pStyle w:val="Heading3"/>
         <w:rPr/>
       </w:pPr>
-      <w:bookmarkStart w:id="14" w:name="_Toc56779027"/>
-      <w:bookmarkStart w:id="15" w:name="_Toc46494753"/>
+      <w:bookmarkStart w:id="17" w:name="__RefHeading___Toc626_888842183"/>
+      <w:bookmarkStart w:id="18" w:name="_Toc46494753"/>
+      <w:bookmarkStart w:id="19" w:name="_Toc56779027"/>
+      <w:bookmarkEnd w:id="17"/>
       <w:r>
         <w:rPr/>
         <w:t>Drop</w:t>
       </w:r>
-      <w:bookmarkEnd w:id="14"/>
-      <w:bookmarkEnd w:id="15"/>
-    </w:p>
-    <w:p>
-      <w:pPr>
-        <w:pStyle w:val="Normal"/>
-        <w:jc w:val="both"/>
-        <w:rPr/>
-      </w:pPr>
-      <w:r>
-        <w:rPr/>
-        <w:t>The PV name from another framework widget may be dragged and dropped onto any group node on the hierarchy. If the dropped onto node is a group node, the new PV name is added to the end of the group. If the dropped onto node is a PV node, the new PV name becomes a sibling of that node, i.e. this is as if it had been dropped on the PV node’s parent group node.</w:t>
-      </w:r>
-    </w:p>
-    <w:p>
-      <w:pPr>
-        <w:pStyle w:val="Normal"/>
-        <w:jc w:val="both"/>
-        <w:rPr/>
-      </w:pPr>
-      <w:r>
-        <w:rPr/>
-        <w:t xml:space="preserve">Note: currently one cannot drag from or between the hierarchy trees. </w:t>
-      </w:r>
-    </w:p>
-    <w:p>
-      <w:pPr>
-        <w:pStyle w:val="Heading3"/>
-        <w:rPr/>
-      </w:pPr>
-      <w:bookmarkStart w:id="16" w:name="_Toc56779028"/>
-      <w:bookmarkStart w:id="17" w:name="_Toc46494754"/>
-      <w:bookmarkStart w:id="18" w:name="_Ref45716023"/>
-      <w:bookmarkStart w:id="19" w:name="_Ref45716009"/>
-      <w:r>
-        <w:rPr/>
-        <w:t>XML File Format</w:t>
-      </w:r>
-      <w:bookmarkEnd w:id="16"/>
-      <w:bookmarkEnd w:id="17"/>
       <w:bookmarkEnd w:id="18"/>
       <w:bookmarkEnd w:id="19"/>
+    </w:p>
+    <w:p>
+      <w:pPr>
+        <w:pStyle w:val="Normal"/>
+        <w:jc w:val="both"/>
+        <w:rPr/>
+      </w:pPr>
+      <w:r>
+        <w:rPr/>
+        <w:t>The PV name from another framework widget may be dragged and dropped onto any group node on the hierarchy. If the dropped onto node is a group node, the new PV name is added to the end of the group. If the dropped onto node is a PV node, the new PV name becomes a sibling of that node, i.e. this is as if it had been dropped on the PV node’s parent group node.</w:t>
+      </w:r>
+    </w:p>
+    <w:p>
+      <w:pPr>
+        <w:pStyle w:val="Normal"/>
+        <w:jc w:val="both"/>
+        <w:rPr/>
+      </w:pPr>
+      <w:r>
+        <w:rPr/>
+        <w:t xml:space="preserve">Note: currently one cannot drag from or between the hierarchy trees. </w:t>
+      </w:r>
+    </w:p>
+    <w:p>
+      <w:pPr>
+        <w:pStyle w:val="Heading3"/>
+        <w:rPr/>
+      </w:pPr>
+      <w:bookmarkStart w:id="20" w:name="__RefHeading___Toc628_888842183"/>
+      <w:bookmarkStart w:id="21" w:name="_Ref45716009"/>
+      <w:bookmarkStart w:id="22" w:name="_Ref45716023"/>
+      <w:bookmarkStart w:id="23" w:name="_Toc46494754"/>
+      <w:bookmarkStart w:id="24" w:name="_Toc56779028"/>
+      <w:bookmarkEnd w:id="20"/>
+      <w:r>
+        <w:rPr/>
+        <w:t>XML File Format</w:t>
+      </w:r>
+      <w:bookmarkEnd w:id="21"/>
+      <w:bookmarkEnd w:id="22"/>
+      <w:bookmarkEnd w:id="23"/>
+      <w:bookmarkEnd w:id="24"/>
     </w:p>
     <w:p>
       <w:pPr>
@@ -3372,8 +2686,8 @@
         <w:jc w:val="center"/>
         <w:rPr/>
       </w:pPr>
-      <w:bookmarkStart w:id="20" w:name="_Ref370137480"/>
-      <w:bookmarkStart w:id="21" w:name="_Ref370137489"/>
+      <w:bookmarkStart w:id="25" w:name="_Ref370137480"/>
+      <w:bookmarkStart w:id="26" w:name="_Ref370137489"/>
       <w:r>
         <w:rPr/>
         <w:t xml:space="preserve">Figure </w:t>
@@ -3398,12 +2712,12 @@
         <w:rPr/>
         <w:fldChar w:fldCharType="end"/>
       </w:r>
-      <w:bookmarkEnd w:id="21"/>
+      <w:bookmarkEnd w:id="26"/>
       <w:r>
         <w:rPr/>
         <w:t xml:space="preserve"> QEPvLoadSave – xml file example.</w:t>
       </w:r>
-      <w:bookmarkEnd w:id="20"/>
+      <w:bookmarkEnd w:id="25"/>
     </w:p>
     <w:p>
       <w:pPr>
@@ -3419,14 +2733,16 @@
         <w:pStyle w:val="Heading3"/>
         <w:rPr/>
       </w:pPr>
-      <w:bookmarkStart w:id="22" w:name="_Toc56779029"/>
+      <w:bookmarkStart w:id="27" w:name="__RefHeading___Toc630_888842183"/>
+      <w:bookmarkStart w:id="28" w:name="_Toc56779029"/>
+      <w:bookmarkEnd w:id="27"/>
       <w:r>
         <w:rPr/>
         <w:t>Merged Node Names</w:t>
       </w:r>
-      <w:bookmarkStart w:id="23" w:name="_Toc46494755"/>
-      <w:bookmarkEnd w:id="22"/>
-      <w:bookmarkEnd w:id="23"/>
+      <w:bookmarkStart w:id="29" w:name="_Toc46494755"/>
+      <w:bookmarkEnd w:id="28"/>
+      <w:bookmarkEnd w:id="29"/>
     </w:p>
     <w:p>
       <w:pPr>
@@ -3533,14 +2849,14 @@
         <w:pStyle w:val="Heading2"/>
         <w:rPr/>
       </w:pPr>
-      <w:bookmarkStart w:id="24" w:name="__RefHeading___Toc479_2825637425"/>
-      <w:bookmarkStart w:id="25" w:name="_Toc56779030"/>
-      <w:bookmarkEnd w:id="24"/>
+      <w:bookmarkStart w:id="30" w:name="__RefHeading___Toc479_2825637425"/>
+      <w:bookmarkStart w:id="31" w:name="_Toc56779030"/>
+      <w:bookmarkEnd w:id="30"/>
       <w:r>
         <w:rPr/>
         <w:t>Properties</w:t>
       </w:r>
-      <w:bookmarkEnd w:id="25"/>
+      <w:bookmarkEnd w:id="31"/>
     </w:p>
     <w:p>
       <w:pPr>
@@ -3557,14 +2873,14 @@
         <w:pStyle w:val="Heading3"/>
         <w:rPr/>
       </w:pPr>
-      <w:bookmarkStart w:id="26" w:name="__RefHeading___Toc897_1117627534"/>
-      <w:bookmarkStart w:id="27" w:name="_Toc56779031"/>
-      <w:bookmarkEnd w:id="26"/>
+      <w:bookmarkStart w:id="32" w:name="__RefHeading___Toc897_1117627534"/>
+      <w:bookmarkStart w:id="33" w:name="_Toc56779031"/>
+      <w:bookmarkEnd w:id="32"/>
       <w:r>
         <w:rPr/>
         <w:t>configurationFileLeft : QString</w:t>
       </w:r>
-      <w:bookmarkEnd w:id="27"/>
+      <w:bookmarkEnd w:id="33"/>
     </w:p>
     <w:p>
       <w:pPr>
@@ -3597,12 +2913,14 @@
         <w:pStyle w:val="Heading3"/>
         <w:rPr/>
       </w:pPr>
-      <w:bookmarkStart w:id="28" w:name="_Toc56779032"/>
+      <w:bookmarkStart w:id="34" w:name="__RefHeading___Toc632_888842183"/>
+      <w:bookmarkStart w:id="35" w:name="_Toc56779032"/>
+      <w:bookmarkEnd w:id="34"/>
       <w:r>
         <w:rPr/>
         <w:t>configurationFileRight : QString</w:t>
       </w:r>
-      <w:bookmarkEnd w:id="28"/>
+      <w:bookmarkEnd w:id="35"/>
     </w:p>
     <w:p>
       <w:pPr>
@@ -3635,12 +2953,14 @@
         <w:pStyle w:val="Heading3"/>
         <w:rPr/>
       </w:pPr>
-      <w:bookmarkStart w:id="29" w:name="_Toc56779033"/>
+      <w:bookmarkStart w:id="36" w:name="__RefHeading___Toc634_888842183"/>
+      <w:bookmarkStart w:id="37" w:name="_Toc56779033"/>
+      <w:bookmarkEnd w:id="36"/>
       <w:r>
         <w:rPr/>
         <w:t>defaultSubstitutions : QString</w:t>
       </w:r>
-      <w:bookmarkEnd w:id="29"/>
+      <w:bookmarkEnd w:id="37"/>
     </w:p>
     <w:p>
       <w:pPr>
@@ -3673,12 +2993,14 @@
         <w:pStyle w:val="Heading3"/>
         <w:rPr/>
       </w:pPr>
-      <w:bookmarkStart w:id="30" w:name="_Toc56779034"/>
+      <w:bookmarkStart w:id="38" w:name="__RefHeading___Toc636_888842183"/>
+      <w:bookmarkStart w:id="39" w:name="_Toc56779034"/>
+      <w:bookmarkEnd w:id="38"/>
       <w:r>
         <w:rPr/>
         <w:t>defaultDir : QString</w:t>
       </w:r>
-      <w:bookmarkEnd w:id="30"/>
+      <w:bookmarkEnd w:id="39"/>
     </w:p>
     <w:p>
       <w:pPr>
@@ -3711,12 +3033,14 @@
         <w:pStyle w:val="Heading3"/>
         <w:rPr/>
       </w:pPr>
-      <w:bookmarkStart w:id="31" w:name="_Toc56779035"/>
+      <w:bookmarkStart w:id="40" w:name="__RefHeading___Toc638_888842183"/>
+      <w:bookmarkStart w:id="41" w:name="_Toc56779035"/>
+      <w:bookmarkEnd w:id="40"/>
       <w:r>
         <w:rPr/>
         <w:t>confirmAction : bool</w:t>
       </w:r>
-      <w:bookmarkEnd w:id="31"/>
+      <w:bookmarkEnd w:id="41"/>
     </w:p>
     <w:p>
       <w:pPr>
@@ -3767,9 +3091,9 @@
           <w:szCs w:val="28"/>
         </w:rPr>
       </w:r>
-      <w:bookmarkStart w:id="32" w:name="__RefHeading___Toc899_1117627534"/>
-      <w:bookmarkStart w:id="33" w:name="__RefHeading___Toc899_1117627534"/>
-      <w:bookmarkEnd w:id="33"/>
+      <w:bookmarkStart w:id="42" w:name="__RefHeading___Toc899_1117627534"/>
+      <w:bookmarkStart w:id="43" w:name="__RefHeading___Toc899_1117627534"/>
+      <w:bookmarkEnd w:id="43"/>
       <w:r>
         <w:br w:type="page"/>
       </w:r>
@@ -3779,26 +3103,28 @@
         <w:pStyle w:val="Heading1"/>
         <w:rPr/>
       </w:pPr>
-      <w:bookmarkStart w:id="34" w:name="_Toc56779036"/>
+      <w:bookmarkStart w:id="44" w:name="__RefHeading___Toc640_888842183"/>
+      <w:bookmarkStart w:id="45" w:name="_Toc56779036"/>
+      <w:bookmarkEnd w:id="44"/>
       <w:r>
         <w:rPr/>
         <w:t>QEPvLoadSaveButton</w:t>
       </w:r>
-      <w:bookmarkEnd w:id="34"/>
+      <w:bookmarkEnd w:id="45"/>
     </w:p>
     <w:p>
       <w:pPr>
         <w:pStyle w:val="Heading2"/>
         <w:rPr/>
       </w:pPr>
-      <w:bookmarkStart w:id="35" w:name="__RefHeading___Toc502_2825637425"/>
-      <w:bookmarkStart w:id="36" w:name="_Toc56779037"/>
-      <w:bookmarkEnd w:id="35"/>
+      <w:bookmarkStart w:id="46" w:name="__RefHeading___Toc502_2825637425"/>
+      <w:bookmarkStart w:id="47" w:name="_Toc56779037"/>
+      <w:bookmarkEnd w:id="46"/>
       <w:r>
         <w:rPr/>
         <w:t>Description</w:t>
       </w:r>
-      <w:bookmarkEnd w:id="36"/>
+      <w:bookmarkEnd w:id="47"/>
     </w:p>
     <w:p>
       <w:pPr>
@@ -3863,12 +3189,14 @@
         <w:pStyle w:val="Heading2"/>
         <w:rPr/>
       </w:pPr>
-      <w:bookmarkStart w:id="37" w:name="_Toc56779038"/>
+      <w:bookmarkStart w:id="48" w:name="__RefHeading___Toc642_888842183"/>
+      <w:bookmarkStart w:id="49" w:name="_Toc56779038"/>
+      <w:bookmarkEnd w:id="48"/>
       <w:r>
         <w:rPr/>
         <w:t>Properties</w:t>
       </w:r>
-      <w:bookmarkEnd w:id="37"/>
+      <w:bookmarkEnd w:id="49"/>
     </w:p>
     <w:p>
       <w:pPr>
@@ -3879,24 +3207,26 @@
         <w:rPr/>
         <w:t>The QEPvLoadSaveButton has the following custom properties</w:t>
       </w:r>
-      <w:bookmarkStart w:id="38" w:name="__RefHeading___Toc947_1117627534"/>
-      <w:bookmarkStart w:id="39" w:name="__RefHeading___Toc939_1117627534"/>
-      <w:bookmarkStart w:id="40" w:name="__RefHeading___Toc483_2825637425"/>
-      <w:bookmarkEnd w:id="38"/>
-      <w:bookmarkEnd w:id="39"/>
-      <w:bookmarkEnd w:id="40"/>
+      <w:bookmarkStart w:id="50" w:name="__RefHeading___Toc483_2825637425"/>
+      <w:bookmarkStart w:id="51" w:name="__RefHeading___Toc939_1117627534"/>
+      <w:bookmarkStart w:id="52" w:name="__RefHeading___Toc947_1117627534"/>
+      <w:bookmarkEnd w:id="50"/>
+      <w:bookmarkEnd w:id="51"/>
+      <w:bookmarkEnd w:id="52"/>
     </w:p>
     <w:p>
       <w:pPr>
         <w:pStyle w:val="Heading3"/>
         <w:rPr/>
       </w:pPr>
-      <w:bookmarkStart w:id="41" w:name="_Toc56779039"/>
+      <w:bookmarkStart w:id="53" w:name="__RefHeading___Toc644_888842183"/>
+      <w:bookmarkStart w:id="54" w:name="_Toc56779039"/>
+      <w:bookmarkEnd w:id="53"/>
       <w:r>
         <w:rPr/>
         <w:t>configurationFile : QString</w:t>
       </w:r>
-      <w:bookmarkEnd w:id="41"/>
+      <w:bookmarkEnd w:id="54"/>
     </w:p>
     <w:p>
       <w:pPr>
@@ -3977,12 +3307,14 @@
         <w:pStyle w:val="Heading3"/>
         <w:rPr/>
       </w:pPr>
-      <w:bookmarkStart w:id="42" w:name="_Toc56779040"/>
+      <w:bookmarkStart w:id="55" w:name="__RefHeading___Toc646_888842183"/>
+      <w:bookmarkStart w:id="56" w:name="_Toc56779040"/>
+      <w:bookmarkEnd w:id="55"/>
       <w:r>
         <w:rPr/>
         <w:t>defaultSubstitutions : QString</w:t>
       </w:r>
-      <w:bookmarkEnd w:id="42"/>
+      <w:bookmarkEnd w:id="56"/>
     </w:p>
     <w:p>
       <w:pPr>
@@ -4015,12 +3347,14 @@
         <w:pStyle w:val="Heading3"/>
         <w:rPr/>
       </w:pPr>
-      <w:bookmarkStart w:id="43" w:name="_Toc56779041"/>
+      <w:bookmarkStart w:id="57" w:name="__RefHeading___Toc648_888842183"/>
+      <w:bookmarkStart w:id="58" w:name="_Toc56779041"/>
+      <w:bookmarkEnd w:id="57"/>
       <w:r>
         <w:rPr/>
         <w:t>action : enumeration</w:t>
       </w:r>
-      <w:bookmarkEnd w:id="43"/>
+      <w:bookmarkEnd w:id="58"/>
     </w:p>
     <w:p>
       <w:pPr>
@@ -4064,12 +3398,14 @@
         <w:pStyle w:val="Heading3"/>
         <w:rPr/>
       </w:pPr>
-      <w:bookmarkStart w:id="44" w:name="_Toc56779042"/>
+      <w:bookmarkStart w:id="59" w:name="__RefHeading___Toc650_888842183"/>
+      <w:bookmarkStart w:id="60" w:name="_Toc56779042"/>
+      <w:bookmarkEnd w:id="59"/>
       <w:r>
         <w:rPr/>
         <w:t>confirmAction : bool</w:t>
       </w:r>
-      <w:bookmarkEnd w:id="44"/>
+      <w:bookmarkEnd w:id="60"/>
     </w:p>
     <w:p>
       <w:pPr>
@@ -4102,12 +3438,14 @@
         <w:pStyle w:val="Heading3"/>
         <w:rPr/>
       </w:pPr>
-      <w:bookmarkStart w:id="45" w:name="_Toc56779043"/>
+      <w:bookmarkStart w:id="61" w:name="__RefHeading___Toc652_888842183"/>
+      <w:bookmarkStart w:id="62" w:name="_Toc56779043"/>
+      <w:bookmarkEnd w:id="61"/>
       <w:r>
         <w:rPr/>
         <w:t>confirmText : QString</w:t>
       </w:r>
-      <w:bookmarkEnd w:id="45"/>
+      <w:bookmarkEnd w:id="62"/>
     </w:p>
     <w:p>
       <w:pPr>
@@ -4140,12 +3478,14 @@
         <w:pStyle w:val="Heading3"/>
         <w:rPr/>
       </w:pPr>
-      <w:bookmarkStart w:id="46" w:name="_Toc56779044"/>
+      <w:bookmarkStart w:id="63" w:name="__RefHeading___Toc654_888842183"/>
+      <w:bookmarkStart w:id="64" w:name="_Toc56779044"/>
+      <w:bookmarkEnd w:id="63"/>
       <w:r>
         <w:rPr/>
         <w:t>showProgressBar : bool</w:t>
       </w:r>
-      <w:bookmarkEnd w:id="46"/>
+      <w:bookmarkEnd w:id="64"/>
     </w:p>
     <w:p>
       <w:pPr>
@@ -4172,8 +3512,8 @@
         <w:rPr/>
         <w:t xml:space="preserve">This controls the display a progress modal dialog while the action is being executed. </w:t>
       </w:r>
-      <w:bookmarkStart w:id="47" w:name="_GoBack"/>
-      <w:bookmarkEnd w:id="47"/>
+      <w:bookmarkStart w:id="65" w:name="_GoBack"/>
+      <w:bookmarkEnd w:id="65"/>
     </w:p>
     <w:p>
       <w:pPr>
@@ -4229,19 +3569,19 @@
       <w:tblLook w:val="00a0" w:noHBand="0" w:noVBand="0" w:firstColumn="1" w:lastRow="0" w:lastColumn="0" w:firstRow="1"/>
     </w:tblPr>
     <w:tblGrid>
-      <w:gridCol w:w="1160"/>
+      <w:gridCol w:w="1159"/>
       <w:gridCol w:w="1036"/>
-      <w:gridCol w:w="1027"/>
+      <w:gridCol w:w="1028"/>
       <w:gridCol w:w="907"/>
-      <w:gridCol w:w="512"/>
-      <w:gridCol w:w="1807"/>
+      <w:gridCol w:w="511"/>
+      <w:gridCol w:w="1808"/>
       <w:gridCol w:w="2576"/>
     </w:tblGrid>
     <w:tr>
       <w:trPr/>
       <w:tc>
         <w:tcPr>
-          <w:tcW w:w="1160" w:type="dxa"/>
+          <w:tcW w:w="1159" w:type="dxa"/>
           <w:tcBorders>
             <w:top w:val="single" w:sz="4" w:space="0" w:color="000000"/>
           </w:tcBorders>
@@ -4293,7 +3633,7 @@
       </w:tc>
       <w:tc>
         <w:tcPr>
-          <w:tcW w:w="1027" w:type="dxa"/>
+          <w:tcW w:w="1028" w:type="dxa"/>
           <w:tcBorders>
             <w:top w:val="single" w:sz="4" w:space="0" w:color="000000"/>
           </w:tcBorders>
@@ -4343,7 +3683,7 @@
       </w:tc>
       <w:tc>
         <w:tcPr>
-          <w:tcW w:w="512" w:type="dxa"/>
+          <w:tcW w:w="511" w:type="dxa"/>
           <w:tcBorders>
             <w:top w:val="single" w:sz="4" w:space="0" w:color="000000"/>
           </w:tcBorders>
@@ -4367,7 +3707,7 @@
       </w:tc>
       <w:tc>
         <w:tcPr>
-          <w:tcW w:w="1807" w:type="dxa"/>
+          <w:tcW w:w="1808" w:type="dxa"/>
           <w:tcBorders>
             <w:top w:val="single" w:sz="4" w:space="0" w:color="000000"/>
           </w:tcBorders>
@@ -5619,6 +4959,7 @@
     <w:rsid w:val="00933637"/>
     <w:pPr>
       <w:widowControl/>
+      <w:suppressAutoHyphens w:val="true"/>
       <w:bidi w:val="0"/>
       <w:spacing w:lineRule="auto" w:line="276" w:before="0" w:after="200"/>
       <w:jc w:val="left"/>
@@ -6073,6 +5414,7 @@
     <w:rsid w:val="008c148d"/>
     <w:pPr>
       <w:widowControl/>
+      <w:suppressAutoHyphens w:val="true"/>
       <w:bidi w:val="0"/>
       <w:spacing w:lineRule="auto" w:line="240" w:before="0" w:after="0"/>
       <w:jc w:val="left"/>
@@ -6166,6 +5508,7 @@
     <w:rsid w:val="00503ead"/>
     <w:pPr>
       <w:widowControl/>
+      <w:suppressAutoHyphens w:val="true"/>
       <w:bidi w:val="0"/>
       <w:spacing w:lineRule="auto" w:line="240" w:before="0" w:after="0"/>
       <w:jc w:val="left"/>
@@ -6262,6 +5605,34 @@
       <w:ind w:left="1760" w:hanging="0"/>
     </w:pPr>
     <w:rPr/>
+  </w:style>
+  <w:style w:type="paragraph" w:styleId="IndexHeading">
+    <w:name w:val="Index Heading"/>
+    <w:basedOn w:val="Heading"/>
+    <w:pPr>
+      <w:suppressLineNumbers/>
+      <w:ind w:left="0" w:hanging="0"/>
+    </w:pPr>
+    <w:rPr>
+      <w:b/>
+      <w:bCs/>
+      <w:sz w:val="32"/>
+      <w:szCs w:val="32"/>
+    </w:rPr>
+  </w:style>
+  <w:style w:type="paragraph" w:styleId="ContentsHeading">
+    <w:name w:val="TOA Heading"/>
+    <w:basedOn w:val="IndexHeading"/>
+    <w:pPr>
+      <w:suppressLineNumbers/>
+      <w:ind w:left="0" w:hanging="0"/>
+    </w:pPr>
+    <w:rPr>
+      <w:b/>
+      <w:bCs/>
+      <w:sz w:val="32"/>
+      <w:szCs w:val="32"/>
+    </w:rPr>
   </w:style>
   <w:style w:type="numbering" w:styleId="NoList" w:default="1">
     <w:name w:val="No List"/>

</xml_diff>